<commit_message>
Correct Coin #2 year to 1947
User verified against the physical coin (previously read as 1974).
</commit_message>
<xml_diff>
--- a/output/Austrian_Coin_Collection_Report.docx
+++ b/output/Austrian_Coin_Collection_Report.docx
@@ -28,7 +28,7 @@
     </w:p>
     <w:p>
       <w:r>
-        <w:t xml:space="preserve">This report catalogs a personal collection of 20 Austrian coins from the Second Republic (post-1945) era, all bearing the Austrian federal eagle obverse (“REPUBLIK ÖSTERREICH”) paired with a Groschen-denomination reverse. Denomination breakdown: 16 x 5 Groschen, 1 x 2 Groschen, 3 x 1 Groschen. Dates range from 1961 to 1984.</w:t>
+        <w:t xml:space="preserve">This report catalogs a personal collection of 20 Austrian coins from the Second Republic (post-1945) era, all bearing the Austrian federal eagle obverse (“REPUBLIK ÖSTERREICH”) paired with a Groschen-denomination reverse. Denomination breakdown: 16 x 5 Groschen, 1 x 2 Groschen, 3 x 1 Groschen. Dates range from 1947 to 1984.</w:t>
       </w:r>
     </w:p>
     <w:p>
@@ -363,7 +363,7 @@
               <w:rPr>
                 <w:sz w:val="16"/>
               </w:rPr>
-              <w:t xml:space="preserve">1974</w:t>
+              <w:t xml:space="preserve">1947</w:t>
             </w:r>
           </w:p>
         </w:tc>

</xml_diff>

<commit_message>
Correct Coin #3 year to 1968
User verified against the physical coin (previously read as 1967).
</commit_message>
<xml_diff>
--- a/output/Austrian_Coin_Collection_Report.docx
+++ b/output/Austrian_Coin_Collection_Report.docx
@@ -471,7 +471,7 @@
               <w:rPr>
                 <w:sz w:val="16"/>
               </w:rPr>
-              <w:t xml:space="preserve">1967</w:t>
+              <w:t xml:space="preserve">1968</w:t>
             </w:r>
           </w:p>
         </w:tc>
@@ -527,7 +527,7 @@
               <w:rPr>
                 <w:sz w:val="16"/>
               </w:rPr>
-              <w:t xml:space="preserve">Obverse: Austrian federal eagle, REPUBLIK OSTERREICH, partial date 67 visible beneath tail feathers. Reverse: large 5, GROSCHEN, edelweiss sprigs. Same design/wear family as Coin 1.</w:t>
+              <w:t xml:space="preserve">Obverse: Austrian federal eagle, REPUBLIK OSTERREICH, partial date visible beneath tail feathers. Reverse: large 5, GROSCHEN, edelweiss sprigs. Same design/wear family as Coin 1.</w:t>
             </w:r>
           </w:p>
         </w:tc>

</xml_diff>

<commit_message>
Apply user verification corrections to coin catalog
Coins #6, #9, #13, #14, #17 corrected against physical coins:
- #6: 1969 -> 1966
- #9: 1961 -> 1947
- #13: 1975 -> 1973
- #14: 2 Groschen 1984 -> 10 Groschen 1948 (zinc)
- #17: 1961 -> 1947
</commit_message>
<xml_diff>
--- a/output/Austrian_Coin_Collection_Report.docx
+++ b/output/Austrian_Coin_Collection_Report.docx
@@ -28,7 +28,7 @@
     </w:p>
     <w:p>
       <w:r>
-        <w:t xml:space="preserve">This report catalogs a personal collection of 20 Austrian coins from the Second Republic (post-1945) era, all bearing the Austrian federal eagle obverse (“REPUBLIK ÖSTERREICH”) paired with a Groschen-denomination reverse. Denomination breakdown: 16 x 5 Groschen, 1 x 2 Groschen, 3 x 1 Groschen. Dates range from 1947 to 1984.</w:t>
+        <w:t xml:space="preserve">This report catalogs a personal collection of 20 Austrian coins from the Second Republic (post-1945) era, all bearing the Austrian federal eagle obverse (“REPUBLIK ÖSTERREICH”) paired with a Groschen-denomination reverse. Denomination breakdown: 1 x 10 Groschen, 16 x 5 Groschen, 3 x 1 Groschen. Dates range from 1947 to 1982.</w:t>
       </w:r>
     </w:p>
     <w:p>
@@ -793,7 +793,7 @@
               <w:rPr>
                 <w:sz w:val="16"/>
               </w:rPr>
-              <w:t xml:space="preserve">1969</w:t>
+              <w:t xml:space="preserve">1966</w:t>
             </w:r>
           </w:p>
         </w:tc>
@@ -853,7 +853,7 @@
               <w:rPr>
                 <w:sz w:val="16"/>
               </w:rPr>
-              <w:t xml:space="preserve">Obverse: Austrian federal eagle with hammer, sickle, broken chain, REPUBLIK OSTERREICH. Reverse: large 5, GROSCHEN, edelweiss sprigs. Moderate corrosion/pitting similar to Coins 1/3/4.</w:t>
+              <w:t xml:space="preserve">Obverse: Austrian federal eagle with hammer, sickle, broken chain, REPUBLIK OSTERREICH. Reverse: large 5, GROSCHEN, edelweiss sprigs. Moderate corrosion/pitting similar to Coins 1/3/4. Same year as Coins 12/20 - duplicate.</w:t>
             </w:r>
           </w:p>
         </w:tc>
@@ -1116,7 +1116,7 @@
               <w:rPr>
                 <w:sz w:val="16"/>
               </w:rPr>
-              <w:t xml:space="preserve">1961</w:t>
+              <w:t xml:space="preserve">1947</w:t>
             </w:r>
           </w:p>
         </w:tc>
@@ -1172,7 +1172,7 @@
               <w:rPr>
                 <w:sz w:val="16"/>
               </w:rPr>
-              <w:t xml:space="preserve">Obverse: Austrian eagle, REPUBLIK OSTERREICH. Reverse: large 1, GROSCHEN. Darker/duller surface than Coin 2, more visible wear.</w:t>
+              <w:t xml:space="preserve">Obverse: Austrian eagle, REPUBLIK OSTERREICH. Reverse: large 1, GROSCHEN. Darker/duller surface than Coin 2, more visible wear. Same year as Coin 2 - duplicate.</w:t>
             </w:r>
           </w:p>
         </w:tc>
@@ -1546,7 +1546,7 @@
               <w:rPr>
                 <w:sz w:val="16"/>
               </w:rPr>
-              <w:t xml:space="preserve">1975</w:t>
+              <w:t xml:space="preserve">1973</w:t>
             </w:r>
           </w:p>
         </w:tc>
@@ -1602,7 +1602,7 @@
               <w:rPr>
                 <w:sz w:val="16"/>
               </w:rPr>
-              <w:t xml:space="preserve">Obverse: Austrian federal eagle with hammer, sickle, broken chain, REPUBLIK OSTERREICH. Reverse: large 5, GROSCHEN, edelweiss sprigs.</w:t>
+              <w:t xml:space="preserve">Obverse: Austrian federal eagle with hammer, sickle, broken chain, REPUBLIK OSTERREICH. Reverse: large 5, GROSCHEN, edelweiss sprigs. Same year as Coins 1/4 - duplicate.</w:t>
             </w:r>
           </w:p>
         </w:tc>
@@ -1638,7 +1638,7 @@
               <w:rPr>
                 <w:sz w:val="16"/>
               </w:rPr>
-              <w:t xml:space="preserve">2 Groschen</w:t>
+              <w:t xml:space="preserve">10 Groschen</w:t>
             </w:r>
           </w:p>
         </w:tc>
@@ -1653,7 +1653,7 @@
               <w:rPr>
                 <w:sz w:val="16"/>
               </w:rPr>
-              <w:t xml:space="preserve">1984</w:t>
+              <w:t xml:space="preserve">1948</w:t>
             </w:r>
           </w:p>
         </w:tc>
@@ -1683,7 +1683,7 @@
               <w:rPr>
                 <w:sz w:val="16"/>
               </w:rPr>
-              <w:t xml:space="preserve">Aluminum</w:t>
+              <w:t xml:space="preserve">Zinc</w:t>
             </w:r>
           </w:p>
         </w:tc>
@@ -1713,7 +1713,7 @@
               <w:rPr>
                 <w:sz w:val="16"/>
               </w:rPr>
-              <w:t xml:space="preserve">Obverse: Austrian eagle, REPUBLIK OSTERREICH. Reverse: large angular 2, GROSCHEN, edelweiss sprigs.</w:t>
+              <w:t xml:space="preserve">Obverse: Austrian federal eagle with hammer, sickle, broken chain, REPUBLIK OSTERREICH. Reverse: large angular 2-digit 10, GROSCHEN, edelweiss sprigs.</w:t>
             </w:r>
           </w:p>
         </w:tc>
@@ -1976,7 +1976,7 @@
               <w:rPr>
                 <w:sz w:val="16"/>
               </w:rPr>
-              <w:t xml:space="preserve">1961</w:t>
+              <w:t xml:space="preserve">1947</w:t>
             </w:r>
           </w:p>
         </w:tc>
@@ -2032,7 +2032,7 @@
               <w:rPr>
                 <w:sz w:val="16"/>
               </w:rPr>
-              <w:t xml:space="preserve">Obverse: Austrian eagle, REPUBLIK OSTERREICH. Reverse: large 1, GROSCHEN. Similar toning/wear to Coin 9 - possible duplicate year.</w:t>
+              <w:t xml:space="preserve">Obverse: Austrian eagle, REPUBLIK OSTERREICH. Reverse: large 1, GROSCHEN. Similar toning/wear to Coin 9 - same year as Coins 2/9, duplicate.</w:t>
             </w:r>
           </w:p>
         </w:tc>

</xml_diff>